<commit_message>
Explain on the site how to add URLs
The published site is static output with no scrape form, which is not obvious from looking at it. Link the two ways to add URLs - running the action with pasted URLs, or editing urls.txt - and point at the web app for an upload form.

Co-Authored-By: Claude Opus 5 <noreply@anthropic.com>
</commit_message>
<xml_diff>
--- a/docs/scraped.docx
+++ b/docs/scraped.docx
@@ -24,7 +24,7 @@
           <w:color w:val="888888"/>
           <w:sz w:val="20"/>
         </w:rPr>
-        <w:t>Generated: September 16, 2026 13:12  ·  4 URL(s) processed</w:t>
+        <w:t>Generated: September 16, 2026 18:58  ·  4 URL(s) processed</w:t>
       </w:r>
     </w:p>
     <w:p/>
@@ -7601,22 +7601,6 @@
     <w:p>
       <w:r>
         <w:t>JPG: https://www.manageengine.com/data-security/file-audit-lp/images/file-server-auditing-solution.jpg (100%x100%)</w:t>
-      </w:r>
-    </w:p>
-    <w:p>
-      <w:r>
-        <w:rPr>
-          <w:sz w:val="22"/>
-        </w:rPr>
-        <w:t>1.Get the big picture: Use the one-stop operational dashboard for a quick overview of recent file and folder access types. Use custom filters to analyze and investigate any sudden changes in access trends.</w:t>
-      </w:r>
-    </w:p>
-    <w:p>
-      <w:r>
-        <w:rPr>
-          <w:sz w:val="22"/>
-        </w:rPr>
-        <w:t>2.Warning signs to look out for: Selectively filter and monitor high-risk access types, such as file extension changes, renaming, deletions, permission changes, and file activities made during non-business hours.</w:t>
       </w:r>
     </w:p>
     <w:p>

</xml_diff>